<commit_message>
modified the exhibits in the backend
</commit_message>
<xml_diff>
--- a/backend-exhibits/Gmail to Gmail Standard Plan - Standard Include.docx
+++ b/backend-exhibits/Gmail to Gmail Standard Plan - Standard Include.docx
@@ -99,7 +99,7 @@
       </w:tr>
       <w:tr>
         <w:trPr>
-          <w:trHeight w:val="617"/>
+          <w:trHeight w:val="531"/>
         </w:trPr>
         <w:tc>
           <w:tcPr>
@@ -154,34 +154,25 @@
             <w:pPr>
               <w:spacing w:line="240" w:lineRule="auto"/>
               <w:rPr>
-                <w:rFonts w:ascii="Arial" w:eastAsia="Times New Roman" w:hAnsi="Arial" w:cs="Arial"/>
-                <w:sz w:val="21"/>
-                <w:szCs w:val="21"/>
-              </w:rPr>
-            </w:pPr>
-            <w:r>
-              <w:rPr>
-                <w:rFonts w:ascii="Arial" w:hAnsi="Arial" w:cs="Arial"/>
-                <w:sz w:val="21"/>
-                <w:szCs w:val="21"/>
-              </w:rPr>
-              <w:t>All emails in the Gmail Inbox will be migrated to the Gmail Inbox.</w:t>
-            </w:r>
-          </w:p>
-          <w:p>
-            <w:pPr>
-              <w:rPr>
-                <w:rFonts w:ascii="Arial" w:hAnsi="Arial" w:cs="Arial"/>
-                <w:sz w:val="21"/>
-                <w:szCs w:val="21"/>
-              </w:rPr>
-            </w:pPr>
+                <w:rFonts w:ascii="Arial" w:hAnsi="Arial" w:cs="Arial"/>
+                <w:sz w:val="21"/>
+                <w:szCs w:val="21"/>
+              </w:rPr>
+            </w:pPr>
+            <w:r>
+              <w:rPr>
+                <w:rFonts w:ascii="Arial" w:hAnsi="Arial" w:cs="Arial"/>
+                <w:sz w:val="21"/>
+                <w:szCs w:val="21"/>
+              </w:rPr>
+              <w:t>An inbox mail is a digital folder for storing and managing received emails.</w:t>
+            </w:r>
           </w:p>
         </w:tc>
       </w:tr>
       <w:tr>
         <w:trPr>
-          <w:trHeight w:val="630"/>
+          <w:trHeight w:val="298"/>
         </w:trPr>
         <w:tc>
           <w:tcPr>
@@ -237,28 +228,19 @@
             <w:pPr>
               <w:spacing w:line="240" w:lineRule="auto"/>
               <w:rPr>
-                <w:rFonts w:ascii="Arial" w:eastAsia="Times New Roman" w:hAnsi="Arial" w:cs="Arial"/>
-                <w:sz w:val="21"/>
-                <w:szCs w:val="21"/>
-              </w:rPr>
-            </w:pPr>
-            <w:r>
-              <w:rPr>
-                <w:rFonts w:ascii="Arial" w:hAnsi="Arial" w:cs="Arial"/>
-                <w:sz w:val="21"/>
-                <w:szCs w:val="21"/>
-              </w:rPr>
-              <w:t>Emails sent by the user in Gmail will be migrated to the Sent Items folder in Gmail.</w:t>
-            </w:r>
-          </w:p>
-          <w:p>
-            <w:pPr>
-              <w:rPr>
-                <w:rFonts w:ascii="Arial" w:hAnsi="Arial" w:cs="Arial"/>
-                <w:sz w:val="21"/>
-                <w:szCs w:val="21"/>
-              </w:rPr>
-            </w:pPr>
+                <w:rFonts w:ascii="Arial" w:hAnsi="Arial" w:cs="Arial"/>
+                <w:sz w:val="21"/>
+                <w:szCs w:val="21"/>
+              </w:rPr>
+            </w:pPr>
+            <w:r>
+              <w:rPr>
+                <w:rFonts w:ascii="Arial" w:hAnsi="Arial" w:cs="Arial"/>
+                <w:sz w:val="21"/>
+                <w:szCs w:val="21"/>
+              </w:rPr>
+              <w:t>Folder for stored copies of sent emails.</w:t>
+            </w:r>
           </w:p>
         </w:tc>
       </w:tr>
@@ -293,6 +275,14 @@
               </w:rPr>
               <w:t>Draft</w:t>
             </w:r>
+            <w:r>
+              <w:rPr>
+                <w:rFonts w:ascii="Arial" w:hAnsi="Arial" w:cs="Arial"/>
+                <w:sz w:val="21"/>
+                <w:szCs w:val="21"/>
+              </w:rPr>
+              <w:t xml:space="preserve"> emails</w:t>
+            </w:r>
           </w:p>
           <w:p>
             <w:pPr>
@@ -319,28 +309,154 @@
             <w:pPr>
               <w:spacing w:line="240" w:lineRule="auto"/>
               <w:rPr>
-                <w:rFonts w:ascii="Arial" w:eastAsia="Times New Roman" w:hAnsi="Arial" w:cs="Arial"/>
-                <w:sz w:val="21"/>
-                <w:szCs w:val="21"/>
-              </w:rPr>
-            </w:pPr>
-            <w:r>
-              <w:rPr>
-                <w:rFonts w:ascii="Arial" w:hAnsi="Arial" w:cs="Arial"/>
-                <w:sz w:val="21"/>
-                <w:szCs w:val="21"/>
-              </w:rPr>
-              <w:t>Draft emails saved in Gmail will be migrated as drafts in Gmail.</w:t>
-            </w:r>
-          </w:p>
-          <w:p>
-            <w:pPr>
-              <w:rPr>
-                <w:rFonts w:ascii="Arial" w:hAnsi="Arial" w:cs="Arial"/>
-                <w:sz w:val="21"/>
-                <w:szCs w:val="21"/>
-              </w:rPr>
-            </w:pPr>
+                <w:rFonts w:ascii="Arial" w:hAnsi="Arial" w:cs="Arial"/>
+                <w:sz w:val="21"/>
+                <w:szCs w:val="21"/>
+              </w:rPr>
+            </w:pPr>
+            <w:r>
+              <w:rPr>
+                <w:rFonts w:ascii="Arial" w:hAnsi="Arial" w:cs="Arial"/>
+                <w:sz w:val="21"/>
+                <w:szCs w:val="21"/>
+              </w:rPr>
+              <w:t>Unfinished or unsent emails saved for future editing and sending. </w:t>
+            </w:r>
+          </w:p>
+        </w:tc>
+      </w:tr>
+      <w:tr>
+        <w:trPr>
+          <w:trHeight w:val="614"/>
+        </w:trPr>
+        <w:tc>
+          <w:tcPr>
+            <w:tcW w:w="3493" w:type="dxa"/>
+            <w:tcBorders>
+              <w:top w:val="single" w:sz="6" w:space="0" w:color="666666"/>
+              <w:left w:val="single" w:sz="6" w:space="0" w:color="666666"/>
+              <w:bottom w:val="single" w:sz="6" w:space="0" w:color="666666"/>
+              <w:right w:val="single" w:sz="6" w:space="0" w:color="666666"/>
+            </w:tcBorders>
+          </w:tcPr>
+          <w:p>
+            <w:pPr>
+              <w:spacing w:line="240" w:lineRule="auto"/>
+              <w:rPr>
+                <w:rFonts w:ascii="Arial" w:hAnsi="Arial" w:cs="Arial"/>
+                <w:sz w:val="21"/>
+                <w:szCs w:val="21"/>
+              </w:rPr>
+            </w:pPr>
+            <w:r>
+              <w:rPr>
+                <w:rFonts w:ascii="Arial" w:hAnsi="Arial" w:cs="Arial"/>
+                <w:sz w:val="21"/>
+                <w:szCs w:val="21"/>
+              </w:rPr>
+              <w:t>Junk mails </w:t>
+            </w:r>
+          </w:p>
+        </w:tc>
+        <w:tc>
+          <w:tcPr>
+            <w:tcW w:w="7228" w:type="dxa"/>
+            <w:tcBorders>
+              <w:top w:val="single" w:sz="6" w:space="0" w:color="666666"/>
+              <w:left w:val="single" w:sz="6" w:space="0" w:color="666666"/>
+              <w:bottom w:val="single" w:sz="6" w:space="0" w:color="666666"/>
+              <w:right w:val="single" w:sz="6" w:space="0" w:color="666666"/>
+            </w:tcBorders>
+          </w:tcPr>
+          <w:p>
+            <w:pPr>
+              <w:spacing w:line="240" w:lineRule="auto"/>
+              <w:rPr>
+                <w:rFonts w:ascii="Arial" w:hAnsi="Arial" w:cs="Arial"/>
+                <w:sz w:val="21"/>
+                <w:szCs w:val="21"/>
+              </w:rPr>
+            </w:pPr>
+            <w:r>
+              <w:rPr>
+                <w:rFonts w:ascii="Arial" w:hAnsi="Arial" w:cs="Arial"/>
+                <w:sz w:val="21"/>
+                <w:szCs w:val="21"/>
+              </w:rPr>
+              <w:t>Unwanted emails, typically containing spam or irrelevant content, are often filtered into a separate folder to reduce clutter in the inbox. </w:t>
+            </w:r>
+          </w:p>
+        </w:tc>
+      </w:tr>
+      <w:tr>
+        <w:trPr>
+          <w:trHeight w:val="596"/>
+        </w:trPr>
+        <w:tc>
+          <w:tcPr>
+            <w:tcW w:w="3493" w:type="dxa"/>
+            <w:tcBorders>
+              <w:top w:val="single" w:sz="6" w:space="0" w:color="666666"/>
+              <w:left w:val="single" w:sz="6" w:space="0" w:color="666666"/>
+              <w:bottom w:val="single" w:sz="6" w:space="0" w:color="666666"/>
+              <w:right w:val="single" w:sz="6" w:space="0" w:color="666666"/>
+            </w:tcBorders>
+          </w:tcPr>
+          <w:p>
+            <w:pPr>
+              <w:spacing w:line="240" w:lineRule="auto"/>
+              <w:rPr>
+                <w:rFonts w:ascii="Arial" w:hAnsi="Arial" w:cs="Arial"/>
+                <w:sz w:val="21"/>
+                <w:szCs w:val="21"/>
+              </w:rPr>
+            </w:pPr>
+            <w:r>
+              <w:rPr>
+                <w:rFonts w:ascii="Arial" w:hAnsi="Arial" w:cs="Arial"/>
+                <w:sz w:val="21"/>
+                <w:szCs w:val="21"/>
+              </w:rPr>
+              <w:t>Deleted emails </w:t>
+            </w:r>
+          </w:p>
+        </w:tc>
+        <w:tc>
+          <w:tcPr>
+            <w:tcW w:w="7228" w:type="dxa"/>
+            <w:tcBorders>
+              <w:top w:val="single" w:sz="6" w:space="0" w:color="666666"/>
+              <w:left w:val="single" w:sz="6" w:space="0" w:color="666666"/>
+              <w:bottom w:val="single" w:sz="6" w:space="0" w:color="666666"/>
+              <w:right w:val="single" w:sz="6" w:space="0" w:color="666666"/>
+            </w:tcBorders>
+          </w:tcPr>
+          <w:p>
+            <w:pPr>
+              <w:spacing w:line="240" w:lineRule="auto"/>
+              <w:rPr>
+                <w:rFonts w:ascii="Arial" w:hAnsi="Arial" w:cs="Arial"/>
+                <w:sz w:val="21"/>
+                <w:szCs w:val="21"/>
+              </w:rPr>
+            </w:pPr>
+            <w:r>
+              <w:rPr>
+                <w:rFonts w:ascii="Arial" w:hAnsi="Arial" w:cs="Arial"/>
+                <w:sz w:val="21"/>
+                <w:szCs w:val="21"/>
+              </w:rPr>
+              <w:t>Emails that have been intentionally deleted or moved to a trash folder</w:t>
+            </w:r>
+            <w:r>
+              <w:rPr>
+                <w:rFonts w:ascii="Arial" w:hAnsi="Arial" w:cs="Arial"/>
+                <w:sz w:val="21"/>
+                <w:szCs w:val="21"/>
+              </w:rPr>
+              <w:br/>
+              <w:t>for removal. </w:t>
+            </w:r>
           </w:p>
         </w:tc>
       </w:tr>
@@ -362,29 +478,19 @@
             <w:pPr>
               <w:spacing w:line="240" w:lineRule="auto"/>
               <w:rPr>
-                <w:rFonts w:ascii="Arial" w:eastAsia="Times New Roman" w:hAnsi="Arial" w:cs="Arial"/>
-                <w:sz w:val="21"/>
-                <w:szCs w:val="21"/>
-              </w:rPr>
-            </w:pPr>
-            <w:r>
-              <w:rPr>
-                <w:rFonts w:ascii="Arial" w:hAnsi="Arial" w:cs="Arial"/>
-                <w:sz w:val="21"/>
-                <w:szCs w:val="21"/>
-              </w:rPr>
-              <w:t>Trash</w:t>
-            </w:r>
-          </w:p>
-          <w:p>
-            <w:pPr>
-              <w:ind w:left="4"/>
-              <w:rPr>
-                <w:rFonts w:ascii="Arial" w:hAnsi="Arial" w:cs="Arial"/>
-                <w:sz w:val="21"/>
-                <w:szCs w:val="21"/>
-              </w:rPr>
-            </w:pPr>
+                <w:rFonts w:ascii="Arial" w:hAnsi="Arial" w:cs="Arial"/>
+                <w:sz w:val="21"/>
+                <w:szCs w:val="21"/>
+              </w:rPr>
+            </w:pPr>
+            <w:r>
+              <w:rPr>
+                <w:rFonts w:ascii="Arial" w:hAnsi="Arial" w:cs="Arial"/>
+                <w:sz w:val="21"/>
+                <w:szCs w:val="21"/>
+              </w:rPr>
+              <w:t>Time stamps </w:t>
+            </w:r>
           </w:p>
         </w:tc>
         <w:tc>
@@ -401,28 +507,19 @@
             <w:pPr>
               <w:spacing w:line="240" w:lineRule="auto"/>
               <w:rPr>
-                <w:rFonts w:ascii="Arial" w:eastAsia="Times New Roman" w:hAnsi="Arial" w:cs="Arial"/>
-                <w:sz w:val="21"/>
-                <w:szCs w:val="21"/>
-              </w:rPr>
-            </w:pPr>
-            <w:r>
-              <w:rPr>
-                <w:rFonts w:ascii="Arial" w:hAnsi="Arial" w:cs="Arial"/>
-                <w:sz w:val="21"/>
-                <w:szCs w:val="21"/>
-              </w:rPr>
-              <w:t>Emails present in the Gmail Trash will be migrated to the Trash in the destination Gmail.</w:t>
-            </w:r>
-          </w:p>
-          <w:p>
-            <w:pPr>
-              <w:rPr>
-                <w:rFonts w:ascii="Arial" w:hAnsi="Arial" w:cs="Arial"/>
-                <w:sz w:val="21"/>
-                <w:szCs w:val="21"/>
-              </w:rPr>
-            </w:pPr>
+                <w:rFonts w:ascii="Arial" w:hAnsi="Arial" w:cs="Arial"/>
+                <w:sz w:val="21"/>
+                <w:szCs w:val="21"/>
+              </w:rPr>
+            </w:pPr>
+            <w:r>
+              <w:rPr>
+                <w:rFonts w:ascii="Arial" w:hAnsi="Arial" w:cs="Arial"/>
+                <w:sz w:val="21"/>
+                <w:szCs w:val="21"/>
+              </w:rPr>
+              <w:t>Retain the timestamp from source to destination.</w:t>
+            </w:r>
           </w:p>
         </w:tc>
       </w:tr>
@@ -444,29 +541,19 @@
             <w:pPr>
               <w:spacing w:line="240" w:lineRule="auto"/>
               <w:rPr>
-                <w:rFonts w:ascii="Arial" w:eastAsia="Times New Roman" w:hAnsi="Arial" w:cs="Arial"/>
-                <w:sz w:val="21"/>
-                <w:szCs w:val="21"/>
-              </w:rPr>
-            </w:pPr>
-            <w:r>
-              <w:rPr>
-                <w:rFonts w:ascii="Arial" w:hAnsi="Arial" w:cs="Arial"/>
-                <w:sz w:val="21"/>
-                <w:szCs w:val="21"/>
-              </w:rPr>
-              <w:t>Archive Emails</w:t>
-            </w:r>
-          </w:p>
-          <w:p>
-            <w:pPr>
-              <w:ind w:left="4"/>
-              <w:rPr>
-                <w:rFonts w:ascii="Arial" w:hAnsi="Arial" w:cs="Arial"/>
-                <w:sz w:val="21"/>
-                <w:szCs w:val="21"/>
-              </w:rPr>
-            </w:pPr>
+                <w:rFonts w:ascii="Arial" w:hAnsi="Arial" w:cs="Arial"/>
+                <w:sz w:val="21"/>
+                <w:szCs w:val="21"/>
+              </w:rPr>
+            </w:pPr>
+            <w:r>
+              <w:rPr>
+                <w:rFonts w:ascii="Arial" w:hAnsi="Arial" w:cs="Arial"/>
+                <w:sz w:val="21"/>
+                <w:szCs w:val="21"/>
+              </w:rPr>
+              <w:t>Maintains Starred/ Important status </w:t>
+            </w:r>
           </w:p>
         </w:tc>
         <w:tc>
@@ -483,112 +570,19 @@
             <w:pPr>
               <w:spacing w:line="240" w:lineRule="auto"/>
               <w:rPr>
-                <w:rFonts w:ascii="Arial" w:eastAsia="Times New Roman" w:hAnsi="Arial" w:cs="Arial"/>
-                <w:sz w:val="21"/>
-                <w:szCs w:val="21"/>
-              </w:rPr>
-            </w:pPr>
-            <w:r>
-              <w:rPr>
-                <w:rFonts w:ascii="Arial" w:hAnsi="Arial" w:cs="Arial"/>
-                <w:sz w:val="21"/>
-                <w:szCs w:val="21"/>
-              </w:rPr>
-              <w:t>Archived emails from the source Gmail will be migrated to the destination Gmail under a newly created label, as Gmail does not have a separate Archive folder.</w:t>
-            </w:r>
-          </w:p>
-          <w:p>
-            <w:pPr>
-              <w:rPr>
-                <w:rFonts w:ascii="Arial" w:hAnsi="Arial" w:cs="Arial"/>
-                <w:sz w:val="21"/>
-                <w:szCs w:val="21"/>
-              </w:rPr>
-            </w:pPr>
-          </w:p>
-        </w:tc>
-      </w:tr>
-      <w:tr>
-        <w:trPr>
-          <w:trHeight w:val="390"/>
-        </w:trPr>
-        <w:tc>
-          <w:tcPr>
-            <w:tcW w:w="3493" w:type="dxa"/>
-            <w:tcBorders>
-              <w:top w:val="single" w:sz="6" w:space="0" w:color="666666"/>
-              <w:left w:val="single" w:sz="6" w:space="0" w:color="666666"/>
-              <w:bottom w:val="single" w:sz="6" w:space="0" w:color="666666"/>
-              <w:right w:val="single" w:sz="6" w:space="0" w:color="666666"/>
-            </w:tcBorders>
-            <w:vAlign w:val="center"/>
-          </w:tcPr>
-          <w:p>
-            <w:pPr>
-              <w:spacing w:line="240" w:lineRule="auto"/>
-              <w:rPr>
-                <w:rFonts w:ascii="Arial" w:eastAsia="Times New Roman" w:hAnsi="Arial" w:cs="Arial"/>
-                <w:sz w:val="21"/>
-                <w:szCs w:val="21"/>
-              </w:rPr>
-            </w:pPr>
-            <w:r>
-              <w:rPr>
-                <w:rFonts w:ascii="Arial" w:hAnsi="Arial" w:cs="Arial"/>
-                <w:sz w:val="21"/>
-                <w:szCs w:val="21"/>
-              </w:rPr>
-              <w:t>Labels</w:t>
-            </w:r>
-          </w:p>
-          <w:p>
-            <w:pPr>
-              <w:ind w:left="4"/>
-              <w:rPr>
-                <w:rFonts w:ascii="Arial" w:hAnsi="Arial" w:cs="Arial"/>
-                <w:sz w:val="21"/>
-                <w:szCs w:val="21"/>
-              </w:rPr>
-            </w:pPr>
-          </w:p>
-        </w:tc>
-        <w:tc>
-          <w:tcPr>
-            <w:tcW w:w="7228" w:type="dxa"/>
-            <w:tcBorders>
-              <w:top w:val="single" w:sz="6" w:space="0" w:color="666666"/>
-              <w:left w:val="single" w:sz="6" w:space="0" w:color="666666"/>
-              <w:bottom w:val="single" w:sz="6" w:space="0" w:color="666666"/>
-              <w:right w:val="single" w:sz="6" w:space="0" w:color="666666"/>
-            </w:tcBorders>
-            <w:vAlign w:val="center"/>
-          </w:tcPr>
-          <w:p>
-            <w:pPr>
-              <w:spacing w:line="240" w:lineRule="auto"/>
-              <w:rPr>
-                <w:rFonts w:ascii="Arial" w:eastAsia="Times New Roman" w:hAnsi="Arial" w:cs="Arial"/>
-                <w:sz w:val="21"/>
-                <w:szCs w:val="21"/>
-              </w:rPr>
-            </w:pPr>
-            <w:r>
-              <w:rPr>
-                <w:rFonts w:ascii="Arial" w:hAnsi="Arial" w:cs="Arial"/>
-                <w:sz w:val="21"/>
-                <w:szCs w:val="21"/>
-              </w:rPr>
-              <w:t>Gmail labels will migrate as label in Destination Gmail.</w:t>
-            </w:r>
-          </w:p>
-          <w:p>
-            <w:pPr>
-              <w:rPr>
-                <w:rFonts w:ascii="Arial" w:hAnsi="Arial" w:cs="Arial"/>
-                <w:sz w:val="21"/>
-                <w:szCs w:val="21"/>
-              </w:rPr>
-            </w:pPr>
+                <w:rFonts w:ascii="Arial" w:hAnsi="Arial" w:cs="Arial"/>
+                <w:sz w:val="21"/>
+                <w:szCs w:val="21"/>
+              </w:rPr>
+            </w:pPr>
+            <w:r>
+              <w:rPr>
+                <w:rFonts w:ascii="Arial" w:hAnsi="Arial" w:cs="Arial"/>
+                <w:sz w:val="21"/>
+                <w:szCs w:val="21"/>
+              </w:rPr>
+              <w:t>Highlighted designation for significant or priority emails. </w:t>
+            </w:r>
           </w:p>
         </w:tc>
       </w:tr>
@@ -610,57 +604,19 @@
             <w:pPr>
               <w:spacing w:line="240" w:lineRule="auto"/>
               <w:rPr>
-                <w:rFonts w:ascii="Arial" w:eastAsia="Times New Roman" w:hAnsi="Arial" w:cs="Arial"/>
-                <w:sz w:val="21"/>
-                <w:szCs w:val="21"/>
-              </w:rPr>
-            </w:pPr>
-            <w:proofErr w:type="spellStart"/>
-            <w:r>
-              <w:rPr>
-                <w:rFonts w:ascii="Arial" w:hAnsi="Arial" w:cs="Arial"/>
-                <w:sz w:val="21"/>
-                <w:szCs w:val="21"/>
-              </w:rPr>
-              <w:t>Deligated</w:t>
-            </w:r>
-            <w:proofErr w:type="spellEnd"/>
-            <w:r>
-              <w:rPr>
-                <w:rFonts w:ascii="Arial" w:hAnsi="Arial" w:cs="Arial"/>
-                <w:sz w:val="21"/>
-                <w:szCs w:val="21"/>
-              </w:rPr>
-              <w:t xml:space="preserve"> </w:t>
-            </w:r>
-            <w:proofErr w:type="gramStart"/>
-            <w:r>
-              <w:rPr>
-                <w:rFonts w:ascii="Arial" w:hAnsi="Arial" w:cs="Arial"/>
-                <w:sz w:val="21"/>
-                <w:szCs w:val="21"/>
-              </w:rPr>
-              <w:t>mail boxes</w:t>
-            </w:r>
-            <w:proofErr w:type="gramEnd"/>
-            <w:r>
-              <w:rPr>
-                <w:rFonts w:ascii="Arial" w:hAnsi="Arial" w:cs="Arial"/>
-                <w:sz w:val="21"/>
-                <w:szCs w:val="21"/>
-              </w:rPr>
-              <w:t xml:space="preserve"> </w:t>
-            </w:r>
-          </w:p>
-          <w:p>
-            <w:pPr>
-              <w:ind w:left="4"/>
-              <w:rPr>
-                <w:rFonts w:ascii="Arial" w:hAnsi="Arial" w:cs="Arial"/>
-                <w:sz w:val="21"/>
-                <w:szCs w:val="21"/>
-              </w:rPr>
-            </w:pPr>
+                <w:rFonts w:ascii="Arial" w:hAnsi="Arial" w:cs="Arial"/>
+                <w:sz w:val="21"/>
+                <w:szCs w:val="21"/>
+              </w:rPr>
+            </w:pPr>
+            <w:r>
+              <w:rPr>
+                <w:rFonts w:ascii="Arial" w:hAnsi="Arial" w:cs="Arial"/>
+                <w:sz w:val="21"/>
+                <w:szCs w:val="21"/>
+              </w:rPr>
+              <w:t>Preserve unread/read status</w:t>
+            </w:r>
           </w:p>
         </w:tc>
         <w:tc>
@@ -677,34 +633,25 @@
             <w:pPr>
               <w:spacing w:line="240" w:lineRule="auto"/>
               <w:rPr>
-                <w:rFonts w:ascii="Arial" w:eastAsia="Times New Roman" w:hAnsi="Arial" w:cs="Arial"/>
-                <w:sz w:val="21"/>
-                <w:szCs w:val="21"/>
-              </w:rPr>
-            </w:pPr>
-            <w:r>
-              <w:rPr>
-                <w:rFonts w:ascii="Arial" w:hAnsi="Arial" w:cs="Arial"/>
-                <w:sz w:val="21"/>
-                <w:szCs w:val="21"/>
-              </w:rPr>
-              <w:t>Emails from delegated Gmail mailboxes will be migrated to Gmail mailbox, but delegation permissions will not be migrated.</w:t>
-            </w:r>
-          </w:p>
-          <w:p>
-            <w:pPr>
-              <w:rPr>
-                <w:rFonts w:ascii="Arial" w:hAnsi="Arial" w:cs="Arial"/>
-                <w:sz w:val="21"/>
-                <w:szCs w:val="21"/>
-              </w:rPr>
-            </w:pPr>
+                <w:rFonts w:ascii="Arial" w:hAnsi="Arial" w:cs="Arial"/>
+                <w:sz w:val="21"/>
+                <w:szCs w:val="21"/>
+              </w:rPr>
+            </w:pPr>
+            <w:r>
+              <w:rPr>
+                <w:rFonts w:ascii="Arial" w:hAnsi="Arial" w:cs="Arial"/>
+                <w:sz w:val="21"/>
+                <w:szCs w:val="21"/>
+              </w:rPr>
+              <w:t>Preserves read &amp; unread status </w:t>
+            </w:r>
           </w:p>
         </w:tc>
       </w:tr>
       <w:tr>
         <w:trPr>
-          <w:trHeight w:val="615"/>
+          <w:trHeight w:val="798"/>
         </w:trPr>
         <w:tc>
           <w:tcPr>
@@ -720,39 +667,19 @@
             <w:pPr>
               <w:spacing w:line="240" w:lineRule="auto"/>
               <w:rPr>
-                <w:rFonts w:ascii="Arial" w:eastAsia="Times New Roman" w:hAnsi="Arial" w:cs="Arial"/>
-                <w:sz w:val="21"/>
-                <w:szCs w:val="21"/>
-              </w:rPr>
-            </w:pPr>
-            <w:r>
-              <w:rPr>
-                <w:rFonts w:ascii="Arial" w:hAnsi="Arial" w:cs="Arial"/>
-                <w:sz w:val="21"/>
-                <w:szCs w:val="21"/>
-              </w:rPr>
-              <w:t xml:space="preserve">Shared </w:t>
-            </w:r>
-            <w:proofErr w:type="spellStart"/>
-            <w:r>
-              <w:rPr>
-                <w:rFonts w:ascii="Arial" w:hAnsi="Arial" w:cs="Arial"/>
-                <w:sz w:val="21"/>
-                <w:szCs w:val="21"/>
-              </w:rPr>
-              <w:t>calanders</w:t>
-            </w:r>
-            <w:proofErr w:type="spellEnd"/>
-          </w:p>
-          <w:p>
-            <w:pPr>
-              <w:ind w:left="4"/>
-              <w:rPr>
-                <w:rFonts w:ascii="Arial" w:hAnsi="Arial" w:cs="Arial"/>
-                <w:sz w:val="21"/>
-                <w:szCs w:val="21"/>
-              </w:rPr>
-            </w:pPr>
+                <w:rFonts w:ascii="Arial" w:hAnsi="Arial" w:cs="Arial"/>
+                <w:sz w:val="21"/>
+                <w:szCs w:val="21"/>
+              </w:rPr>
+            </w:pPr>
+            <w:r>
+              <w:rPr>
+                <w:rFonts w:ascii="Arial" w:hAnsi="Arial" w:cs="Arial"/>
+                <w:sz w:val="21"/>
+                <w:szCs w:val="21"/>
+              </w:rPr>
+              <w:t>Mail attachment </w:t>
+            </w:r>
           </w:p>
         </w:tc>
         <w:tc>
@@ -769,34 +696,25 @@
             <w:pPr>
               <w:spacing w:line="240" w:lineRule="auto"/>
               <w:rPr>
-                <w:rFonts w:ascii="Arial" w:eastAsia="Times New Roman" w:hAnsi="Arial" w:cs="Arial"/>
-                <w:sz w:val="21"/>
-                <w:szCs w:val="21"/>
-              </w:rPr>
-            </w:pPr>
-            <w:r>
-              <w:rPr>
-                <w:rFonts w:ascii="Arial" w:hAnsi="Arial" w:cs="Arial"/>
-                <w:sz w:val="21"/>
-                <w:szCs w:val="21"/>
-              </w:rPr>
-              <w:t>Shared calendar events will be migrated based on the event organizer. If a user creates an event in another user’s shared calendar, that event will migrate when the creator’s mailbox is migrated.</w:t>
-            </w:r>
-          </w:p>
-          <w:p>
-            <w:pPr>
-              <w:rPr>
-                <w:rFonts w:ascii="Arial" w:hAnsi="Arial" w:cs="Arial"/>
-                <w:sz w:val="21"/>
-                <w:szCs w:val="21"/>
-              </w:rPr>
-            </w:pPr>
+                <w:rFonts w:ascii="Arial" w:hAnsi="Arial" w:cs="Arial"/>
+                <w:sz w:val="21"/>
+                <w:szCs w:val="21"/>
+              </w:rPr>
+            </w:pPr>
+            <w:r>
+              <w:rPr>
+                <w:rFonts w:ascii="Arial" w:hAnsi="Arial" w:cs="Arial"/>
+                <w:sz w:val="21"/>
+                <w:szCs w:val="21"/>
+              </w:rPr>
+              <w:t>Files or documents sent alongside an email, allowing users to share additional information or multimedia content. Attachments can include various file types such as documents, images, videos, or audio files.</w:t>
+            </w:r>
           </w:p>
         </w:tc>
       </w:tr>
       <w:tr>
         <w:trPr>
-          <w:trHeight w:val="630"/>
+          <w:trHeight w:val="375"/>
         </w:trPr>
         <w:tc>
           <w:tcPr>
@@ -812,29 +730,19 @@
             <w:pPr>
               <w:spacing w:line="240" w:lineRule="auto"/>
               <w:rPr>
-                <w:rFonts w:ascii="Arial" w:eastAsia="Times New Roman" w:hAnsi="Arial" w:cs="Arial"/>
-                <w:sz w:val="21"/>
-                <w:szCs w:val="21"/>
-              </w:rPr>
-            </w:pPr>
-            <w:r>
-              <w:rPr>
-                <w:rFonts w:ascii="Arial" w:hAnsi="Arial" w:cs="Arial"/>
-                <w:sz w:val="21"/>
-                <w:szCs w:val="21"/>
-              </w:rPr>
-              <w:t xml:space="preserve">Calanders </w:t>
-            </w:r>
-          </w:p>
-          <w:p>
-            <w:pPr>
-              <w:ind w:left="4"/>
-              <w:rPr>
-                <w:rFonts w:ascii="Arial" w:hAnsi="Arial" w:cs="Arial"/>
-                <w:sz w:val="21"/>
-                <w:szCs w:val="21"/>
-              </w:rPr>
-            </w:pPr>
+                <w:rFonts w:ascii="Arial" w:hAnsi="Arial" w:cs="Arial"/>
+                <w:sz w:val="21"/>
+                <w:szCs w:val="21"/>
+              </w:rPr>
+            </w:pPr>
+            <w:r>
+              <w:rPr>
+                <w:rFonts w:ascii="Arial" w:hAnsi="Arial" w:cs="Arial"/>
+                <w:sz w:val="21"/>
+                <w:szCs w:val="21"/>
+              </w:rPr>
+              <w:t>Calendar events (Normal events/ Recurring events )</w:t>
+            </w:r>
           </w:p>
         </w:tc>
         <w:tc>
@@ -851,34 +759,25 @@
             <w:pPr>
               <w:spacing w:line="240" w:lineRule="auto"/>
               <w:rPr>
-                <w:rFonts w:ascii="Arial" w:eastAsia="Times New Roman" w:hAnsi="Arial" w:cs="Arial"/>
-                <w:sz w:val="21"/>
-                <w:szCs w:val="21"/>
-              </w:rPr>
-            </w:pPr>
-            <w:r>
-              <w:rPr>
-                <w:rFonts w:ascii="Arial" w:hAnsi="Arial" w:cs="Arial"/>
-                <w:sz w:val="21"/>
-                <w:szCs w:val="21"/>
-              </w:rPr>
-              <w:t>Personal Gmail calendar events will be migrated to Outlook Calendar, and attendees will be retained.</w:t>
-            </w:r>
-          </w:p>
-          <w:p>
-            <w:pPr>
-              <w:rPr>
-                <w:rFonts w:ascii="Arial" w:hAnsi="Arial" w:cs="Arial"/>
-                <w:sz w:val="21"/>
-                <w:szCs w:val="21"/>
-              </w:rPr>
-            </w:pPr>
+                <w:rFonts w:ascii="Arial" w:hAnsi="Arial" w:cs="Arial"/>
+                <w:sz w:val="21"/>
+                <w:szCs w:val="21"/>
+              </w:rPr>
+            </w:pPr>
+            <w:r>
+              <w:rPr>
+                <w:rFonts w:ascii="Arial" w:hAnsi="Arial" w:cs="Arial"/>
+                <w:sz w:val="21"/>
+                <w:szCs w:val="21"/>
+              </w:rPr>
+              <w:t>Normal &amp; Recurring event schedules </w:t>
+            </w:r>
           </w:p>
         </w:tc>
       </w:tr>
       <w:tr>
         <w:trPr>
-          <w:trHeight w:val="615"/>
+          <w:trHeight w:val="375"/>
         </w:trPr>
         <w:tc>
           <w:tcPr>
@@ -894,29 +793,29 @@
             <w:pPr>
               <w:spacing w:line="240" w:lineRule="auto"/>
               <w:rPr>
-                <w:rFonts w:ascii="Arial" w:eastAsia="Times New Roman" w:hAnsi="Arial" w:cs="Arial"/>
-                <w:sz w:val="21"/>
-                <w:szCs w:val="21"/>
-              </w:rPr>
-            </w:pPr>
-            <w:r>
-              <w:rPr>
-                <w:rFonts w:ascii="Arial" w:hAnsi="Arial" w:cs="Arial"/>
-                <w:sz w:val="21"/>
-                <w:szCs w:val="21"/>
-              </w:rPr>
-              <w:t>Contacts</w:t>
-            </w:r>
-          </w:p>
-          <w:p>
-            <w:pPr>
-              <w:ind w:left="4"/>
-              <w:rPr>
-                <w:rFonts w:ascii="Arial" w:hAnsi="Arial" w:cs="Arial"/>
-                <w:sz w:val="21"/>
-                <w:szCs w:val="21"/>
-              </w:rPr>
-            </w:pPr>
+                <w:rFonts w:ascii="Arial" w:hAnsi="Arial" w:cs="Arial"/>
+                <w:sz w:val="21"/>
+                <w:szCs w:val="21"/>
+              </w:rPr>
+            </w:pPr>
+            <w:proofErr w:type="spellStart"/>
+            <w:r>
+              <w:rPr>
+                <w:rFonts w:ascii="Arial" w:hAnsi="Arial" w:cs="Arial"/>
+                <w:sz w:val="21"/>
+                <w:szCs w:val="21"/>
+              </w:rPr>
+              <w:t>Calender</w:t>
+            </w:r>
+            <w:proofErr w:type="spellEnd"/>
+            <w:r>
+              <w:rPr>
+                <w:rFonts w:ascii="Arial" w:hAnsi="Arial" w:cs="Arial"/>
+                <w:sz w:val="21"/>
+                <w:szCs w:val="21"/>
+              </w:rPr>
+              <w:t xml:space="preserve"> event time stamps </w:t>
+            </w:r>
           </w:p>
         </w:tc>
         <w:tc>
@@ -933,34 +832,25 @@
             <w:pPr>
               <w:spacing w:line="240" w:lineRule="auto"/>
               <w:rPr>
-                <w:rFonts w:ascii="Arial" w:eastAsia="Times New Roman" w:hAnsi="Arial" w:cs="Arial"/>
-                <w:sz w:val="21"/>
-                <w:szCs w:val="21"/>
-              </w:rPr>
-            </w:pPr>
-            <w:r>
-              <w:rPr>
-                <w:rFonts w:ascii="Arial" w:hAnsi="Arial" w:cs="Arial"/>
-                <w:sz w:val="21"/>
-                <w:szCs w:val="21"/>
-              </w:rPr>
-              <w:t>All Gmail contacts will be migrated to Gmail</w:t>
-            </w:r>
-          </w:p>
-          <w:p>
-            <w:pPr>
-              <w:rPr>
-                <w:rFonts w:ascii="Arial" w:hAnsi="Arial" w:cs="Arial"/>
-                <w:sz w:val="21"/>
-                <w:szCs w:val="21"/>
-              </w:rPr>
-            </w:pPr>
+                <w:rFonts w:ascii="Arial" w:hAnsi="Arial" w:cs="Arial"/>
+                <w:sz w:val="21"/>
+                <w:szCs w:val="21"/>
+              </w:rPr>
+            </w:pPr>
+            <w:r>
+              <w:rPr>
+                <w:rFonts w:ascii="Arial" w:hAnsi="Arial" w:cs="Arial"/>
+                <w:sz w:val="21"/>
+                <w:szCs w:val="21"/>
+              </w:rPr>
+              <w:t>Calendar event timestamps will maintain </w:t>
+            </w:r>
           </w:p>
         </w:tc>
       </w:tr>
       <w:tr>
         <w:trPr>
-          <w:trHeight w:val="390"/>
+          <w:trHeight w:val="375"/>
         </w:trPr>
         <w:tc>
           <w:tcPr>
@@ -971,35 +861,24 @@
               <w:bottom w:val="single" w:sz="6" w:space="0" w:color="666666"/>
               <w:right w:val="single" w:sz="6" w:space="0" w:color="666666"/>
             </w:tcBorders>
-            <w:vAlign w:val="center"/>
-          </w:tcPr>
-          <w:p>
-            <w:pPr>
-              <w:spacing w:line="240" w:lineRule="auto"/>
-              <w:rPr>
-                <w:rFonts w:ascii="Arial" w:eastAsia="Times New Roman" w:hAnsi="Arial" w:cs="Arial"/>
-                <w:sz w:val="21"/>
-                <w:szCs w:val="21"/>
-              </w:rPr>
-            </w:pPr>
-            <w:r>
-              <w:rPr>
-                <w:rFonts w:ascii="Arial" w:hAnsi="Arial" w:cs="Arial"/>
-                <w:sz w:val="21"/>
-                <w:szCs w:val="21"/>
-              </w:rPr>
-              <w:t xml:space="preserve">Attachments in emails </w:t>
-            </w:r>
-          </w:p>
-          <w:p>
-            <w:pPr>
-              <w:ind w:left="4"/>
-              <w:rPr>
-                <w:rFonts w:ascii="Arial" w:hAnsi="Arial" w:cs="Arial"/>
-                <w:sz w:val="21"/>
-                <w:szCs w:val="21"/>
-              </w:rPr>
-            </w:pPr>
+          </w:tcPr>
+          <w:p>
+            <w:pPr>
+              <w:spacing w:line="240" w:lineRule="auto"/>
+              <w:rPr>
+                <w:rFonts w:ascii="Arial" w:hAnsi="Arial" w:cs="Arial"/>
+                <w:sz w:val="21"/>
+                <w:szCs w:val="21"/>
+              </w:rPr>
+            </w:pPr>
+            <w:r>
+              <w:rPr>
+                <w:rFonts w:ascii="Arial" w:hAnsi="Arial" w:cs="Arial"/>
+                <w:sz w:val="21"/>
+                <w:szCs w:val="21"/>
+              </w:rPr>
+              <w:t>Calendar event attachments </w:t>
+            </w:r>
           </w:p>
         </w:tc>
         <w:tc>
@@ -1011,374 +890,24 @@
               <w:bottom w:val="single" w:sz="6" w:space="0" w:color="666666"/>
               <w:right w:val="single" w:sz="6" w:space="0" w:color="666666"/>
             </w:tcBorders>
-            <w:vAlign w:val="center"/>
-          </w:tcPr>
-          <w:p>
-            <w:pPr>
-              <w:spacing w:line="240" w:lineRule="auto"/>
-              <w:rPr>
-                <w:rFonts w:ascii="Arial" w:eastAsia="Times New Roman" w:hAnsi="Arial" w:cs="Arial"/>
-                <w:sz w:val="21"/>
-                <w:szCs w:val="21"/>
-              </w:rPr>
-            </w:pPr>
-            <w:r>
-              <w:rPr>
-                <w:rFonts w:ascii="Arial" w:hAnsi="Arial" w:cs="Arial"/>
-                <w:sz w:val="21"/>
-                <w:szCs w:val="21"/>
-              </w:rPr>
-              <w:t>Attachments added to Gmail emails will be migrated along with the emails into Gmail.</w:t>
-            </w:r>
-          </w:p>
-          <w:p>
-            <w:pPr>
-              <w:rPr>
-                <w:rFonts w:ascii="Arial" w:hAnsi="Arial" w:cs="Arial"/>
-                <w:sz w:val="21"/>
-                <w:szCs w:val="21"/>
-              </w:rPr>
-            </w:pPr>
-          </w:p>
-        </w:tc>
-      </w:tr>
-      <w:tr>
-        <w:trPr>
-          <w:trHeight w:val="855"/>
-        </w:trPr>
-        <w:tc>
-          <w:tcPr>
-            <w:tcW w:w="3493" w:type="dxa"/>
-            <w:tcBorders>
-              <w:top w:val="single" w:sz="6" w:space="0" w:color="666666"/>
-              <w:left w:val="single" w:sz="6" w:space="0" w:color="666666"/>
-              <w:bottom w:val="single" w:sz="6" w:space="0" w:color="666666"/>
-              <w:right w:val="single" w:sz="6" w:space="0" w:color="666666"/>
-            </w:tcBorders>
-          </w:tcPr>
-          <w:p>
-            <w:pPr>
-              <w:spacing w:line="240" w:lineRule="auto"/>
-              <w:rPr>
-                <w:rFonts w:ascii="Arial" w:eastAsia="Times New Roman" w:hAnsi="Arial" w:cs="Arial"/>
-                <w:sz w:val="21"/>
-                <w:szCs w:val="21"/>
-              </w:rPr>
-            </w:pPr>
-            <w:r>
-              <w:rPr>
-                <w:rFonts w:ascii="Arial" w:hAnsi="Arial" w:cs="Arial"/>
-                <w:sz w:val="21"/>
-                <w:szCs w:val="21"/>
-              </w:rPr>
-              <w:t xml:space="preserve">Attachments in </w:t>
-            </w:r>
-            <w:proofErr w:type="spellStart"/>
-            <w:r>
-              <w:rPr>
-                <w:rFonts w:ascii="Arial" w:hAnsi="Arial" w:cs="Arial"/>
-                <w:sz w:val="21"/>
-                <w:szCs w:val="21"/>
-              </w:rPr>
-              <w:t>calanders</w:t>
-            </w:r>
-            <w:proofErr w:type="spellEnd"/>
-          </w:p>
-          <w:p>
-            <w:pPr>
-              <w:ind w:left="4"/>
-              <w:rPr>
-                <w:rFonts w:ascii="Arial" w:hAnsi="Arial" w:cs="Arial"/>
-                <w:sz w:val="21"/>
-                <w:szCs w:val="21"/>
-              </w:rPr>
-            </w:pPr>
-          </w:p>
-        </w:tc>
-        <w:tc>
-          <w:tcPr>
-            <w:tcW w:w="7228" w:type="dxa"/>
-            <w:tcBorders>
-              <w:top w:val="single" w:sz="6" w:space="0" w:color="666666"/>
-              <w:left w:val="single" w:sz="6" w:space="0" w:color="666666"/>
-              <w:bottom w:val="single" w:sz="6" w:space="0" w:color="666666"/>
-              <w:right w:val="single" w:sz="6" w:space="0" w:color="666666"/>
-            </w:tcBorders>
-          </w:tcPr>
-          <w:p>
-            <w:pPr>
-              <w:spacing w:line="240" w:lineRule="auto"/>
-              <w:rPr>
-                <w:rFonts w:ascii="Arial" w:eastAsia="Times New Roman" w:hAnsi="Arial" w:cs="Arial"/>
-                <w:sz w:val="21"/>
-                <w:szCs w:val="21"/>
-              </w:rPr>
-            </w:pPr>
-            <w:r>
-              <w:rPr>
-                <w:rFonts w:ascii="Arial" w:hAnsi="Arial" w:cs="Arial"/>
-                <w:sz w:val="21"/>
-                <w:szCs w:val="21"/>
-              </w:rPr>
-              <w:t>Attachments inside Gmail calendar events will be migrated to the corresponding Gmail calendar events</w:t>
-            </w:r>
-          </w:p>
-          <w:p>
-            <w:pPr>
-              <w:rPr>
-                <w:rFonts w:ascii="Arial" w:hAnsi="Arial" w:cs="Arial"/>
-                <w:sz w:val="21"/>
-                <w:szCs w:val="21"/>
-              </w:rPr>
-            </w:pPr>
-          </w:p>
-        </w:tc>
-      </w:tr>
-      <w:tr>
-        <w:trPr>
-          <w:trHeight w:val="630"/>
-        </w:trPr>
-        <w:tc>
-          <w:tcPr>
-            <w:tcW w:w="3493" w:type="dxa"/>
-            <w:tcBorders>
-              <w:top w:val="single" w:sz="6" w:space="0" w:color="666666"/>
-              <w:left w:val="single" w:sz="6" w:space="0" w:color="666666"/>
-              <w:bottom w:val="single" w:sz="6" w:space="0" w:color="666666"/>
-              <w:right w:val="single" w:sz="6" w:space="0" w:color="666666"/>
-            </w:tcBorders>
-          </w:tcPr>
-          <w:p>
-            <w:pPr>
-              <w:spacing w:line="240" w:lineRule="auto"/>
-              <w:rPr>
-                <w:rFonts w:ascii="Arial" w:eastAsia="Times New Roman" w:hAnsi="Arial" w:cs="Arial"/>
-                <w:sz w:val="21"/>
-                <w:szCs w:val="21"/>
-              </w:rPr>
-            </w:pPr>
-            <w:r>
-              <w:rPr>
-                <w:rFonts w:ascii="Arial" w:hAnsi="Arial" w:cs="Arial"/>
-                <w:sz w:val="21"/>
-                <w:szCs w:val="21"/>
-              </w:rPr>
-              <w:t xml:space="preserve">Categories- Social, update, forums and promotions. </w:t>
-            </w:r>
-          </w:p>
-          <w:p>
-            <w:pPr>
-              <w:ind w:left="4"/>
-              <w:rPr>
-                <w:rFonts w:ascii="Arial" w:hAnsi="Arial" w:cs="Arial"/>
-                <w:sz w:val="21"/>
-                <w:szCs w:val="21"/>
-              </w:rPr>
-            </w:pPr>
-          </w:p>
-        </w:tc>
-        <w:tc>
-          <w:tcPr>
-            <w:tcW w:w="7228" w:type="dxa"/>
-            <w:tcBorders>
-              <w:top w:val="single" w:sz="6" w:space="0" w:color="666666"/>
-              <w:left w:val="single" w:sz="6" w:space="0" w:color="666666"/>
-              <w:bottom w:val="single" w:sz="6" w:space="0" w:color="666666"/>
-              <w:right w:val="single" w:sz="6" w:space="0" w:color="666666"/>
-            </w:tcBorders>
-          </w:tcPr>
-          <w:p>
-            <w:pPr>
-              <w:spacing w:line="240" w:lineRule="auto"/>
-              <w:rPr>
-                <w:rFonts w:ascii="Arial" w:eastAsia="Times New Roman" w:hAnsi="Arial" w:cs="Arial"/>
-                <w:sz w:val="21"/>
-                <w:szCs w:val="21"/>
-              </w:rPr>
-            </w:pPr>
-            <w:r>
-              <w:rPr>
-                <w:rFonts w:ascii="Arial" w:hAnsi="Arial" w:cs="Arial"/>
-                <w:sz w:val="21"/>
-                <w:szCs w:val="21"/>
-              </w:rPr>
-              <w:t>Emails from Gmail’s category tabs will be migrated to Outlook as a new custom folder</w:t>
-            </w:r>
-          </w:p>
-          <w:p>
-            <w:pPr>
-              <w:rPr>
-                <w:rFonts w:ascii="Arial" w:hAnsi="Arial" w:cs="Arial"/>
-                <w:sz w:val="21"/>
-                <w:szCs w:val="21"/>
-              </w:rPr>
-            </w:pPr>
-          </w:p>
-        </w:tc>
-      </w:tr>
-      <w:tr>
-        <w:trPr>
-          <w:trHeight w:val="615"/>
-        </w:trPr>
-        <w:tc>
-          <w:tcPr>
-            <w:tcW w:w="3493" w:type="dxa"/>
-            <w:tcBorders>
-              <w:top w:val="single" w:sz="6" w:space="0" w:color="666666"/>
-              <w:left w:val="single" w:sz="6" w:space="0" w:color="666666"/>
-              <w:bottom w:val="single" w:sz="6" w:space="0" w:color="666666"/>
-              <w:right w:val="single" w:sz="6" w:space="0" w:color="666666"/>
-            </w:tcBorders>
-          </w:tcPr>
-          <w:p>
-            <w:pPr>
-              <w:spacing w:line="240" w:lineRule="auto"/>
-              <w:rPr>
-                <w:rFonts w:ascii="Arial" w:eastAsia="Times New Roman" w:hAnsi="Arial" w:cs="Arial"/>
-                <w:sz w:val="21"/>
-                <w:szCs w:val="21"/>
-              </w:rPr>
-            </w:pPr>
-            <w:r>
-              <w:rPr>
-                <w:rFonts w:ascii="Arial" w:hAnsi="Arial" w:cs="Arial"/>
-                <w:sz w:val="21"/>
-                <w:szCs w:val="21"/>
-              </w:rPr>
-              <w:t xml:space="preserve">Groups </w:t>
-            </w:r>
-          </w:p>
-          <w:p>
-            <w:pPr>
-              <w:ind w:left="4"/>
-              <w:rPr>
-                <w:rFonts w:ascii="Arial" w:hAnsi="Arial" w:cs="Arial"/>
-                <w:sz w:val="21"/>
-                <w:szCs w:val="21"/>
-              </w:rPr>
-            </w:pPr>
-          </w:p>
-        </w:tc>
-        <w:tc>
-          <w:tcPr>
-            <w:tcW w:w="7228" w:type="dxa"/>
-            <w:tcBorders>
-              <w:top w:val="single" w:sz="6" w:space="0" w:color="666666"/>
-              <w:left w:val="single" w:sz="6" w:space="0" w:color="666666"/>
-              <w:bottom w:val="single" w:sz="6" w:space="0" w:color="666666"/>
-              <w:right w:val="single" w:sz="6" w:space="0" w:color="666666"/>
-            </w:tcBorders>
-          </w:tcPr>
-          <w:p>
-            <w:pPr>
-              <w:spacing w:line="240" w:lineRule="auto"/>
-              <w:rPr>
-                <w:rFonts w:ascii="Arial" w:eastAsia="Times New Roman" w:hAnsi="Arial" w:cs="Arial"/>
-                <w:sz w:val="21"/>
-                <w:szCs w:val="21"/>
-              </w:rPr>
-            </w:pPr>
-            <w:r>
-              <w:rPr>
-                <w:rFonts w:ascii="Arial" w:hAnsi="Arial" w:cs="Arial"/>
-                <w:sz w:val="21"/>
-                <w:szCs w:val="21"/>
-              </w:rPr>
-              <w:t>Groups will be migrated to outlook</w:t>
-            </w:r>
-          </w:p>
-          <w:p>
-            <w:pPr>
-              <w:rPr>
-                <w:rFonts w:ascii="Arial" w:hAnsi="Arial" w:cs="Arial"/>
-                <w:sz w:val="21"/>
-                <w:szCs w:val="21"/>
-              </w:rPr>
-            </w:pPr>
-          </w:p>
-        </w:tc>
-      </w:tr>
-      <w:tr>
-        <w:trPr>
-          <w:trHeight w:val="615"/>
-        </w:trPr>
-        <w:tc>
-          <w:tcPr>
-            <w:tcW w:w="3493" w:type="dxa"/>
-            <w:tcBorders>
-              <w:top w:val="single" w:sz="6" w:space="0" w:color="666666"/>
-              <w:left w:val="single" w:sz="6" w:space="0" w:color="666666"/>
-              <w:bottom w:val="single" w:sz="6" w:space="0" w:color="666666"/>
-              <w:right w:val="single" w:sz="6" w:space="0" w:color="666666"/>
-            </w:tcBorders>
-          </w:tcPr>
-          <w:p>
-            <w:pPr>
-              <w:spacing w:line="240" w:lineRule="auto"/>
-              <w:rPr>
-                <w:rFonts w:ascii="Arial" w:eastAsia="Times New Roman" w:hAnsi="Arial" w:cs="Arial"/>
-                <w:sz w:val="21"/>
-                <w:szCs w:val="21"/>
-              </w:rPr>
-            </w:pPr>
-            <w:r>
-              <w:rPr>
-                <w:rFonts w:ascii="Arial" w:hAnsi="Arial" w:cs="Arial"/>
-                <w:sz w:val="21"/>
-                <w:szCs w:val="21"/>
-              </w:rPr>
-              <w:lastRenderedPageBreak/>
-              <w:t>Spam</w:t>
-            </w:r>
-          </w:p>
-          <w:p>
-            <w:pPr>
-              <w:spacing w:line="240" w:lineRule="auto"/>
-              <w:rPr>
-                <w:rFonts w:ascii="Arial" w:hAnsi="Arial" w:cs="Arial"/>
-                <w:sz w:val="21"/>
-                <w:szCs w:val="21"/>
-              </w:rPr>
-            </w:pPr>
-          </w:p>
-        </w:tc>
-        <w:tc>
-          <w:tcPr>
-            <w:tcW w:w="7228" w:type="dxa"/>
-            <w:tcBorders>
-              <w:top w:val="single" w:sz="6" w:space="0" w:color="666666"/>
-              <w:left w:val="single" w:sz="6" w:space="0" w:color="666666"/>
-              <w:bottom w:val="single" w:sz="6" w:space="0" w:color="666666"/>
-              <w:right w:val="single" w:sz="6" w:space="0" w:color="666666"/>
-            </w:tcBorders>
-          </w:tcPr>
-          <w:p>
-            <w:pPr>
-              <w:spacing w:line="240" w:lineRule="auto"/>
-              <w:rPr>
-                <w:rFonts w:ascii="Arial" w:eastAsia="Times New Roman" w:hAnsi="Arial" w:cs="Arial"/>
-                <w:sz w:val="21"/>
-                <w:szCs w:val="21"/>
-              </w:rPr>
-            </w:pPr>
-            <w:r>
-              <w:rPr>
-                <w:rFonts w:ascii="Arial" w:hAnsi="Arial" w:cs="Arial"/>
-                <w:sz w:val="21"/>
-                <w:szCs w:val="21"/>
-              </w:rPr>
-              <w:t>Emails in spam will be migrated into Junk folder in Outlook</w:t>
-            </w:r>
-          </w:p>
-          <w:p>
-            <w:pPr>
-              <w:spacing w:line="240" w:lineRule="auto"/>
-              <w:rPr>
-                <w:rFonts w:ascii="Arial" w:hAnsi="Arial" w:cs="Arial"/>
-                <w:sz w:val="21"/>
-                <w:szCs w:val="21"/>
-              </w:rPr>
-            </w:pPr>
+          </w:tcPr>
+          <w:p>
+            <w:pPr>
+              <w:spacing w:line="240" w:lineRule="auto"/>
+              <w:rPr>
+                <w:rFonts w:ascii="Arial" w:hAnsi="Arial" w:cs="Arial"/>
+                <w:sz w:val="21"/>
+                <w:szCs w:val="21"/>
+              </w:rPr>
+            </w:pPr>
+            <w:r>
+              <w:rPr>
+                <w:rFonts w:ascii="Arial" w:hAnsi="Arial" w:cs="Arial"/>
+                <w:sz w:val="21"/>
+                <w:szCs w:val="21"/>
+              </w:rPr>
+              <w:t>Calendar event attachments will maintain</w:t>
+            </w:r>
           </w:p>
         </w:tc>
       </w:tr>
@@ -1805,7 +1334,6 @@
   <w:style w:type="character" w:default="1" w:styleId="DefaultParagraphFont">
     <w:name w:val="Default Paragraph Font"/>
     <w:uiPriority w:val="1"/>
-    <w:semiHidden/>
     <w:unhideWhenUsed/>
   </w:style>
   <w:style w:type="table" w:default="1" w:styleId="TableNormal">

</xml_diff>